<commit_message>
TS 1.7 Ghanam tamil and sanskrit final
</commit_message>
<xml_diff>
--- a/TS Jatai Ghanam Project/TS 1.7/TS 1.7 Ghanam Sanskrit Corrections.docx
+++ b/TS Jatai Ghanam Project/TS 1.7/TS 1.7 Ghanam Sanskrit Corrections.docx
@@ -1576,7 +1576,26 @@
                 <w:szCs w:val="40"/>
                 <w:highlight w:val="green"/>
               </w:rPr>
-              <w:t>wrÉÉlÉç.</w:t>
+              <w:t>wrÉÉlÉ</w:t>
+            </w:r>
+            <w:r>
+              <w:rPr>
+                <w:rFonts w:ascii="BRH Devanagari Extra" w:hAnsi="BRH Devanagari Extra" w:cs="BRH Devanagari Extra"/>
+                <w:color w:val="000000"/>
+                <w:sz w:val="32"/>
+                <w:szCs w:val="40"/>
+              </w:rPr>
+              <w:t>þ</w:t>
+            </w:r>
+            <w:r>
+              <w:rPr>
+                <w:rFonts w:ascii="BRH Devanagari Extra" w:hAnsi="BRH Devanagari Extra" w:cs="BRH Devanagari Extra"/>
+                <w:color w:val="000000"/>
+                <w:sz w:val="32"/>
+                <w:szCs w:val="40"/>
+                <w:highlight w:val="green"/>
+              </w:rPr>
+              <w:t>ç.</w:t>
             </w:r>
             <w:r>
               <w:rPr>

</xml_diff>